<commit_message>
Replace provisional payer scenarios with empirical payer-to-Medicare ratios
The Medicaid (flat 0.70x Medicare) and commercial (flat 1.75x) scenarios
now scale each reimbursement input by its own within-hospital
payer-to-Medicare ratio measured in national hospital price-transparency
data (Trilliant Health MRF Data Directory, 2026-07-21 snapshot, via
hpt_prices @ 6de7ea8): Medicaid 0.78-0.92, commercial 1.49-1.80.
Combined biopsy remains the least expensive strategy under both payers
(Medicaid advantage $225, commercial $339); the base case is unchanged.
Manuscript Methods cites the data as new reference 12 (references
renumbered 13-19), Discussion reads "empirical" payer-mix scenarios,
and Tables 1/8, Figure 5, docs, and tests are updated.

Co-Authored-By: Claude Opus 5 <noreply@anthropic.com>
Claude-Session: https://claude.ai/code/session_01DaPqEsptQdWDLk4uNL5ydn
</commit_message>
<xml_diff>
--- a/manuscript/manuscript.docx
+++ b/manuscript/manuscript.docx
@@ -1100,7 +1100,19 @@
         <w:t xml:space="preserve"> </w:t>
       </w:r>
       <w:r>
-        <w:t xml:space="preserve">analysis, modeling illustrative Medicaid/commercial reimbursement and an</w:t>
+        <w:t xml:space="preserve">analysis, modeling Medicaid/commercial reimbursement using hospital price-transparency payer ratios</w:t>
+      </w:r>
+      <w:r>
+        <w:rPr>
+          <w:vertAlign w:val="superscript"/>
+        </w:rPr>
+        <w:t xml:space="preserve">12</w:t>
+      </w:r>
+      <w:r>
+        <w:t xml:space="preserve"> </w:t>
+      </w:r>
+      <w:r>
+        <w:t xml:space="preserve">and an</w:t>
       </w:r>
       <w:r>
         <w:t xml:space="preserve"> </w:t>
@@ -1210,7 +1222,7 @@
         <w:rPr>
           <w:vertAlign w:val="superscript"/>
         </w:rPr>
-        <w:t xml:space="preserve">12</w:t>
+        <w:t xml:space="preserve">13</w:t>
       </w:r>
       <w:r>
         <w:t xml:space="preserve"> </w:t>
@@ -1273,60 +1285,6 @@
       </w:r>
       <w:r>
         <w:t xml:space="preserve">hemorrhage, pooled from a cohort of 5,359 nonobstetric D&amp;Cs)</w:t>
-      </w:r>
-      <w:r>
-        <w:rPr>
-          <w:vertAlign w:val="superscript"/>
-        </w:rPr>
-        <w:t xml:space="preserve">13</w:t>
-      </w:r>
-      <w:r>
-        <w:t xml:space="preserve"> </w:t>
-      </w:r>
-      <w:r>
-        <w:t xml:space="preserve">as a</w:t>
-      </w:r>
-      <w:r>
-        <w:t xml:space="preserve"> </w:t>
-      </w:r>
-      <w:r>
-        <w:t xml:space="preserve">function of that strategy’s probability of ultimately requiring D&amp;C, either</w:t>
-      </w:r>
-      <w:r>
-        <w:t xml:space="preserve"> </w:t>
-      </w:r>
-      <w:r>
-        <w:t xml:space="preserve">as the primary procedure or as a rescue procedure after a failed sampling</w:t>
-      </w:r>
-      <w:r>
-        <w:t xml:space="preserve"> </w:t>
-      </w:r>
-      <w:r>
-        <w:t xml:space="preserve">attempt. Second, we estimated each arm’s probability of a failed sampling</w:t>
-      </w:r>
-      <w:r>
-        <w:t xml:space="preserve"> </w:t>
-      </w:r>
-      <w:r>
-        <w:t xml:space="preserve">attempt going undiagnosed for cancer or precancer, combined with the</w:t>
-      </w:r>
-      <w:r>
-        <w:t xml:space="preserve"> </w:t>
-      </w:r>
-      <w:r>
-        <w:t xml:space="preserve">probability of cancer or precancer among women with a failed or insufficient</w:t>
-      </w:r>
-      <w:r>
-        <w:t xml:space="preserve"> </w:t>
-      </w:r>
-      <w:r>
-        <w:t xml:space="preserve">sample, drawn from a general (non-Lynch) postmenopausal-bleeding</w:t>
-      </w:r>
-      <w:r>
-        <w:t xml:space="preserve"> </w:t>
-      </w:r>
-      <w:r>
-        <w:t xml:space="preserve">meta-analysis.</w:t>
       </w:r>
       <w:r>
         <w:rPr>
@@ -1338,87 +1296,43 @@
         <w:t xml:space="preserve"> </w:t>
       </w:r>
       <w:r>
-        <w:t xml:space="preserve">Under the repeat-attempt-or-D&amp;C structure described</w:t>
-      </w:r>
-      <w:r>
-        <w:t xml:space="preserve"> </w:t>
-      </w:r>
-      <w:r>
-        <w:t xml:space="preserve">above, the office arm’s failed attempts are accounted for entirely by</w:t>
-      </w:r>
-      <w:r>
-        <w:t xml:space="preserve"> </w:t>
-      </w:r>
-      <w:r>
-        <w:t xml:space="preserve">either a successful repeat or escalation to D&amp;C, leaving no probability</w:t>
-      </w:r>
-      <w:r>
-        <w:t xml:space="preserve"> </w:t>
-      </w:r>
-      <w:r>
-        <w:t xml:space="preserve">mass for a sample that is neither adequately resampled nor escalated; the</w:t>
-      </w:r>
-      <w:r>
-        <w:t xml:space="preserve"> </w:t>
-      </w:r>
-      <w:r>
-        <w:t xml:space="preserve">combined arm’s directly observed escalation rate similarly accounts for</w:t>
-      </w:r>
-      <w:r>
-        <w:t xml:space="preserve"> </w:t>
-      </w:r>
-      <w:r>
-        <w:t xml:space="preserve">essentially all combined-biopsy failures. Neither arm therefore retained an</w:t>
-      </w:r>
-      <w:r>
-        <w:t xml:space="preserve"> </w:t>
-      </w:r>
-      <w:r>
-        <w:t xml:space="preserve">estimable undiagnosed-failure probability under current evidence; this null</w:t>
-      </w:r>
-      <w:r>
-        <w:t xml:space="preserve"> </w:t>
-      </w:r>
-      <w:r>
-        <w:t xml:space="preserve">result, and what it does and does not imply, is addressed in the</w:t>
-      </w:r>
-      <w:r>
-        <w:t xml:space="preserve"> </w:t>
-      </w:r>
-      <w:r>
-        <w:t xml:space="preserve">Discussion.</w:t>
-      </w:r>
-    </w:p>
-    <w:p>
-      <w:pPr>
-        <w:pStyle w:val="BodyText"/>
-      </w:pPr>
-      <w:r>
-        <w:t xml:space="preserve">As a separate, deterministic check on the same equivalent-effectiveness</w:t>
-      </w:r>
-      <w:r>
-        <w:t xml:space="preserve"> </w:t>
-      </w:r>
-      <w:r>
-        <w:t xml:space="preserve">assumption, we also computed each strategy’s overall probability of</w:t>
-      </w:r>
-      <w:r>
-        <w:t xml:space="preserve"> </w:t>
-      </w:r>
-      <w:r>
-        <w:t xml:space="preserve">detecting a true cancer or endometrial hyperplasia, combining each arm’s</w:t>
-      </w:r>
-      <w:r>
-        <w:t xml:space="preserve"> </w:t>
-      </w:r>
-      <w:r>
-        <w:t xml:space="preserve">sampling-escalation probabilities with published Pipelle and D&amp;C</w:t>
-      </w:r>
-      <w:r>
-        <w:t xml:space="preserve"> </w:t>
-      </w:r>
-      <w:r>
-        <w:t xml:space="preserve">sensitivities from a general (non-Lynch) diagnostic-accuracy</w:t>
+        <w:t xml:space="preserve">as a</w:t>
+      </w:r>
+      <w:r>
+        <w:t xml:space="preserve"> </w:t>
+      </w:r>
+      <w:r>
+        <w:t xml:space="preserve">function of that strategy’s probability of ultimately requiring D&amp;C, either</w:t>
+      </w:r>
+      <w:r>
+        <w:t xml:space="preserve"> </w:t>
+      </w:r>
+      <w:r>
+        <w:t xml:space="preserve">as the primary procedure or as a rescue procedure after a failed sampling</w:t>
+      </w:r>
+      <w:r>
+        <w:t xml:space="preserve"> </w:t>
+      </w:r>
+      <w:r>
+        <w:t xml:space="preserve">attempt. Second, we estimated each arm’s probability of a failed sampling</w:t>
+      </w:r>
+      <w:r>
+        <w:t xml:space="preserve"> </w:t>
+      </w:r>
+      <w:r>
+        <w:t xml:space="preserve">attempt going undiagnosed for cancer or precancer, combined with the</w:t>
+      </w:r>
+      <w:r>
+        <w:t xml:space="preserve"> </w:t>
+      </w:r>
+      <w:r>
+        <w:t xml:space="preserve">probability of cancer or precancer among women with a failed or insufficient</w:t>
+      </w:r>
+      <w:r>
+        <w:t xml:space="preserve"> </w:t>
+      </w:r>
+      <w:r>
+        <w:t xml:space="preserve">sample, drawn from a general (non-Lynch) postmenopausal-bleeding</w:t>
       </w:r>
       <w:r>
         <w:t xml:space="preserve"> </w:t>
@@ -1436,19 +1350,55 @@
         <w:t xml:space="preserve"> </w:t>
       </w:r>
       <w:r>
-        <w:t xml:space="preserve">This calculation is a point estimate only, not</w:t>
-      </w:r>
-      <w:r>
-        <w:t xml:space="preserve"> </w:t>
-      </w:r>
-      <w:r>
-        <w:t xml:space="preserve">integrated into the probabilistic sensitivity analysis; see Discussion for</w:t>
-      </w:r>
-      <w:r>
-        <w:t xml:space="preserve"> </w:t>
-      </w:r>
-      <w:r>
-        <w:t xml:space="preserve">its limitations.</w:t>
+        <w:t xml:space="preserve">Under the repeat-attempt-or-D&amp;C structure described</w:t>
+      </w:r>
+      <w:r>
+        <w:t xml:space="preserve"> </w:t>
+      </w:r>
+      <w:r>
+        <w:t xml:space="preserve">above, the office arm’s failed attempts are accounted for entirely by</w:t>
+      </w:r>
+      <w:r>
+        <w:t xml:space="preserve"> </w:t>
+      </w:r>
+      <w:r>
+        <w:t xml:space="preserve">either a successful repeat or escalation to D&amp;C, leaving no probability</w:t>
+      </w:r>
+      <w:r>
+        <w:t xml:space="preserve"> </w:t>
+      </w:r>
+      <w:r>
+        <w:t xml:space="preserve">mass for a sample that is neither adequately resampled nor escalated; the</w:t>
+      </w:r>
+      <w:r>
+        <w:t xml:space="preserve"> </w:t>
+      </w:r>
+      <w:r>
+        <w:t xml:space="preserve">combined arm’s directly observed escalation rate similarly accounts for</w:t>
+      </w:r>
+      <w:r>
+        <w:t xml:space="preserve"> </w:t>
+      </w:r>
+      <w:r>
+        <w:t xml:space="preserve">essentially all combined-biopsy failures. Neither arm therefore retained an</w:t>
+      </w:r>
+      <w:r>
+        <w:t xml:space="preserve"> </w:t>
+      </w:r>
+      <w:r>
+        <w:t xml:space="preserve">estimable undiagnosed-failure probability under current evidence; this null</w:t>
+      </w:r>
+      <w:r>
+        <w:t xml:space="preserve"> </w:t>
+      </w:r>
+      <w:r>
+        <w:t xml:space="preserve">result, and what it does and does not imply, is addressed in the</w:t>
+      </w:r>
+      <w:r>
+        <w:t xml:space="preserve"> </w:t>
+      </w:r>
+      <w:r>
+        <w:t xml:space="preserve">Discussion.</w:t>
       </w:r>
     </w:p>
     <w:p>
@@ -1456,63 +1406,37 @@
         <w:pStyle w:val="BodyText"/>
       </w:pPr>
       <w:r>
-        <w:t xml:space="preserve">As a lighter alternative to a full cost-utility analysis, we also</w:t>
-      </w:r>
-      <w:r>
-        <w:t xml:space="preserve"> </w:t>
-      </w:r>
-      <w:r>
-        <w:t xml:space="preserve">computed cost per additional true case detected between adjacent</w:t>
-      </w:r>
-      <w:r>
-        <w:t xml:space="preserve"> </w:t>
-      </w:r>
-      <w:r>
-        <w:t xml:space="preserve">strategies, combining costs with the detection probabilities above and</w:t>
-      </w:r>
-      <w:r>
-        <w:t xml:space="preserve"> </w:t>
-      </w:r>
-      <w:r>
-        <w:t xml:space="preserve">checking for dominance; also a point estimate, not PSA-integrated.</w:t>
-      </w:r>
-    </w:p>
-    <w:p>
-      <w:pPr>
-        <w:pStyle w:val="BodyText"/>
-      </w:pPr>
-      <w:r>
-        <w:t xml:space="preserve">As a supplementary societal-perspective check, we reintroduced patient</w:t>
-      </w:r>
-      <w:r>
-        <w:t xml:space="preserve"> </w:t>
-      </w:r>
-      <w:r>
-        <w:t xml:space="preserve">time and travel-time opportunity costs the base case excludes: each</w:t>
-      </w:r>
-      <w:r>
-        <w:t xml:space="preserve"> </w:t>
-      </w:r>
-      <w:r>
-        <w:t xml:space="preserve">strategy’s expected number of dedicated patient encounters (office or</w:t>
-      </w:r>
-      <w:r>
-        <w:t xml:space="preserve"> </w:t>
-      </w:r>
-      <w:r>
-        <w:t xml:space="preserve">preoperative visits, repeat visits, and D&amp;C’s own preoperative visit plus</w:t>
-      </w:r>
-      <w:r>
-        <w:t xml:space="preserve"> </w:t>
-      </w:r>
-      <w:r>
-        <w:t xml:space="preserve">procedure day, weighted by the same escalation probabilities) was valued</w:t>
-      </w:r>
-      <w:r>
-        <w:t xml:space="preserve"> </w:t>
-      </w:r>
-      <w:r>
-        <w:t xml:space="preserve">at a published average opportunity cost per ambulatory visit.</w:t>
+        <w:t xml:space="preserve">As a separate, deterministic check on the same equivalent-effectiveness</w:t>
+      </w:r>
+      <w:r>
+        <w:t xml:space="preserve"> </w:t>
+      </w:r>
+      <w:r>
+        <w:t xml:space="preserve">assumption, we also computed each strategy’s overall probability of</w:t>
+      </w:r>
+      <w:r>
+        <w:t xml:space="preserve"> </w:t>
+      </w:r>
+      <w:r>
+        <w:t xml:space="preserve">detecting a true cancer or endometrial hyperplasia, combining each arm’s</w:t>
+      </w:r>
+      <w:r>
+        <w:t xml:space="preserve"> </w:t>
+      </w:r>
+      <w:r>
+        <w:t xml:space="preserve">sampling-escalation probabilities with published Pipelle and D&amp;C</w:t>
+      </w:r>
+      <w:r>
+        <w:t xml:space="preserve"> </w:t>
+      </w:r>
+      <w:r>
+        <w:t xml:space="preserve">sensitivities from a general (non-Lynch) diagnostic-accuracy</w:t>
+      </w:r>
+      <w:r>
+        <w:t xml:space="preserve"> </w:t>
+      </w:r>
+      <w:r>
+        <w:t xml:space="preserve">meta-analysis.</w:t>
       </w:r>
       <w:r>
         <w:rPr>
@@ -1524,31 +1448,19 @@
         <w:t xml:space="preserve"> </w:t>
       </w:r>
       <w:r>
-        <w:t xml:space="preserve">This</w:t>
-      </w:r>
-      <w:r>
-        <w:t xml:space="preserve"> </w:t>
-      </w:r>
-      <w:r>
-        <w:t xml:space="preserve">deterministic, non-PSA calculation values every encounter equally and</w:t>
-      </w:r>
-      <w:r>
-        <w:t xml:space="preserve"> </w:t>
-      </w:r>
-      <w:r>
-        <w:t xml:space="preserve">excludes travel expense and caregiver time (see Discussion); we also</w:t>
-      </w:r>
-      <w:r>
-        <w:t xml:space="preserve"> </w:t>
-      </w:r>
-      <w:r>
-        <w:t xml:space="preserve">report it under the existing scenario folding combined biopsy’s</w:t>
-      </w:r>
-      <w:r>
-        <w:t xml:space="preserve"> </w:t>
-      </w:r>
-      <w:r>
-        <w:t xml:space="preserve">preoperative visit into the colonoscopy day.</w:t>
+        <w:t xml:space="preserve">This calculation is a point estimate only, not</w:t>
+      </w:r>
+      <w:r>
+        <w:t xml:space="preserve"> </w:t>
+      </w:r>
+      <w:r>
+        <w:t xml:space="preserve">integrated into the probabilistic sensitivity analysis; see Discussion for</w:t>
+      </w:r>
+      <w:r>
+        <w:t xml:space="preserve"> </w:t>
+      </w:r>
+      <w:r>
+        <w:t xml:space="preserve">its limitations.</w:t>
       </w:r>
     </w:p>
     <w:p>
@@ -1556,61 +1468,25 @@
         <w:pStyle w:val="BodyText"/>
       </w:pPr>
       <w:r>
-        <w:t xml:space="preserve">The geographic sensitivity analysis characterizes setting-level</w:t>
-      </w:r>
-      <w:r>
-        <w:t xml:space="preserve"> </w:t>
-      </w:r>
-      <w:r>
-        <w:t xml:space="preserve">heterogeneity (how the base-case conclusion varies by practice location),</w:t>
-      </w:r>
-      <w:r>
-        <w:t xml:space="preserve"> </w:t>
-      </w:r>
-      <w:r>
-        <w:t xml:space="preserve">not patient-level heterogeneity: the model does not stratify results by</w:t>
-      </w:r>
-      <w:r>
-        <w:t xml:space="preserve"> </w:t>
-      </w:r>
-      <w:r>
-        <w:t xml:space="preserve">age, genotype, menopausal status, or other individual characteristics.</w:t>
-      </w:r>
-      <w:r>
-        <w:t xml:space="preserve"> </w:t>
-      </w:r>
-      <w:r>
-        <w:t xml:space="preserve">Distributional or equity effects (e.g., differential access or affordability</w:t>
-      </w:r>
-      <w:r>
-        <w:t xml:space="preserve"> </w:t>
-      </w:r>
-      <w:r>
-        <w:t xml:space="preserve">across patient subgroups) were outside this analysis’s scope. Structural</w:t>
-      </w:r>
-      <w:r>
-        <w:t xml:space="preserve"> </w:t>
-      </w:r>
-      <w:r>
-        <w:t xml:space="preserve">modeling assumptions describing clinical workflow (e.g., whether the</w:t>
-      </w:r>
-      <w:r>
-        <w:t xml:space="preserve"> </w:t>
-      </w:r>
-      <w:r>
-        <w:t xml:space="preserve">combined arm requires a separate preoperative office visit) were informed</w:t>
-      </w:r>
-      <w:r>
-        <w:t xml:space="preserve"> </w:t>
-      </w:r>
-      <w:r>
-        <w:t xml:space="preserve">by clinician-investigator practice experience; no formal patient or public</w:t>
-      </w:r>
-      <w:r>
-        <w:t xml:space="preserve"> </w:t>
-      </w:r>
-      <w:r>
-        <w:t xml:space="preserve">engagement process was undertaken.</w:t>
+        <w:t xml:space="preserve">As a lighter alternative to a full cost-utility analysis, we also</w:t>
+      </w:r>
+      <w:r>
+        <w:t xml:space="preserve"> </w:t>
+      </w:r>
+      <w:r>
+        <w:t xml:space="preserve">computed cost per additional true case detected between adjacent</w:t>
+      </w:r>
+      <w:r>
+        <w:t xml:space="preserve"> </w:t>
+      </w:r>
+      <w:r>
+        <w:t xml:space="preserve">strategies, combining costs with the detection probabilities above and</w:t>
+      </w:r>
+      <w:r>
+        <w:t xml:space="preserve"> </w:t>
+      </w:r>
+      <w:r>
+        <w:t xml:space="preserve">checking for dominance; also a point estimate, not PSA-integrated.</w:t>
       </w:r>
     </w:p>
     <w:p>
@@ -1618,19 +1494,37 @@
         <w:pStyle w:val="BodyText"/>
       </w:pPr>
       <w:r>
-        <w:t xml:space="preserve">We compared the model’s cost estimates against three independently</w:t>
-      </w:r>
-      <w:r>
-        <w:t xml:space="preserve"> </w:t>
-      </w:r>
-      <w:r>
-        <w:t xml:space="preserve">published analyses as a validation check: a historical office-biopsy cost</w:t>
-      </w:r>
-      <w:r>
-        <w:t xml:space="preserve"> </w:t>
-      </w:r>
-      <w:r>
-        <w:t xml:space="preserve">anchor,</w:t>
+        <w:t xml:space="preserve">As a supplementary societal-perspective check, we reintroduced patient</w:t>
+      </w:r>
+      <w:r>
+        <w:t xml:space="preserve"> </w:t>
+      </w:r>
+      <w:r>
+        <w:t xml:space="preserve">time and travel-time opportunity costs the base case excludes: each</w:t>
+      </w:r>
+      <w:r>
+        <w:t xml:space="preserve"> </w:t>
+      </w:r>
+      <w:r>
+        <w:t xml:space="preserve">strategy’s expected number of dedicated patient encounters (office or</w:t>
+      </w:r>
+      <w:r>
+        <w:t xml:space="preserve"> </w:t>
+      </w:r>
+      <w:r>
+        <w:t xml:space="preserve">preoperative visits, repeat visits, and D&amp;C’s own preoperative visit plus</w:t>
+      </w:r>
+      <w:r>
+        <w:t xml:space="preserve"> </w:t>
+      </w:r>
+      <w:r>
+        <w:t xml:space="preserve">procedure day, weighted by the same escalation probabilities) was valued</w:t>
+      </w:r>
+      <w:r>
+        <w:t xml:space="preserve"> </w:t>
+      </w:r>
+      <w:r>
+        <w:t xml:space="preserve">at a published average opportunity cost per ambulatory visit.</w:t>
       </w:r>
       <w:r>
         <w:rPr>
@@ -1642,6 +1536,124 @@
         <w:t xml:space="preserve"> </w:t>
       </w:r>
       <w:r>
+        <w:t xml:space="preserve">This</w:t>
+      </w:r>
+      <w:r>
+        <w:t xml:space="preserve"> </w:t>
+      </w:r>
+      <w:r>
+        <w:t xml:space="preserve">deterministic, non-PSA calculation values every encounter equally and</w:t>
+      </w:r>
+      <w:r>
+        <w:t xml:space="preserve"> </w:t>
+      </w:r>
+      <w:r>
+        <w:t xml:space="preserve">excludes travel expense and caregiver time (see Discussion); we also</w:t>
+      </w:r>
+      <w:r>
+        <w:t xml:space="preserve"> </w:t>
+      </w:r>
+      <w:r>
+        <w:t xml:space="preserve">report it under the existing scenario folding combined biopsy’s</w:t>
+      </w:r>
+      <w:r>
+        <w:t xml:space="preserve"> </w:t>
+      </w:r>
+      <w:r>
+        <w:t xml:space="preserve">preoperative visit into the colonoscopy day.</w:t>
+      </w:r>
+    </w:p>
+    <w:p>
+      <w:pPr>
+        <w:pStyle w:val="BodyText"/>
+      </w:pPr>
+      <w:r>
+        <w:t xml:space="preserve">The geographic sensitivity analysis characterizes setting-level</w:t>
+      </w:r>
+      <w:r>
+        <w:t xml:space="preserve"> </w:t>
+      </w:r>
+      <w:r>
+        <w:t xml:space="preserve">heterogeneity (how the base-case conclusion varies by practice location),</w:t>
+      </w:r>
+      <w:r>
+        <w:t xml:space="preserve"> </w:t>
+      </w:r>
+      <w:r>
+        <w:t xml:space="preserve">not patient-level heterogeneity: the model does not stratify results by</w:t>
+      </w:r>
+      <w:r>
+        <w:t xml:space="preserve"> </w:t>
+      </w:r>
+      <w:r>
+        <w:t xml:space="preserve">age, genotype, menopausal status, or other individual characteristics.</w:t>
+      </w:r>
+      <w:r>
+        <w:t xml:space="preserve"> </w:t>
+      </w:r>
+      <w:r>
+        <w:t xml:space="preserve">Distributional or equity effects (e.g., differential access or affordability</w:t>
+      </w:r>
+      <w:r>
+        <w:t xml:space="preserve"> </w:t>
+      </w:r>
+      <w:r>
+        <w:t xml:space="preserve">across patient subgroups) were outside this analysis’s scope. Structural</w:t>
+      </w:r>
+      <w:r>
+        <w:t xml:space="preserve"> </w:t>
+      </w:r>
+      <w:r>
+        <w:t xml:space="preserve">modeling assumptions describing clinical workflow (e.g., whether the</w:t>
+      </w:r>
+      <w:r>
+        <w:t xml:space="preserve"> </w:t>
+      </w:r>
+      <w:r>
+        <w:t xml:space="preserve">combined arm requires a separate preoperative office visit) were informed</w:t>
+      </w:r>
+      <w:r>
+        <w:t xml:space="preserve"> </w:t>
+      </w:r>
+      <w:r>
+        <w:t xml:space="preserve">by clinician-investigator practice experience; no formal patient or public</w:t>
+      </w:r>
+      <w:r>
+        <w:t xml:space="preserve"> </w:t>
+      </w:r>
+      <w:r>
+        <w:t xml:space="preserve">engagement process was undertaken.</w:t>
+      </w:r>
+    </w:p>
+    <w:p>
+      <w:pPr>
+        <w:pStyle w:val="BodyText"/>
+      </w:pPr>
+      <w:r>
+        <w:t xml:space="preserve">We compared the model’s cost estimates against three independently</w:t>
+      </w:r>
+      <w:r>
+        <w:t xml:space="preserve"> </w:t>
+      </w:r>
+      <w:r>
+        <w:t xml:space="preserve">published analyses as a validation check: a historical office-biopsy cost</w:t>
+      </w:r>
+      <w:r>
+        <w:t xml:space="preserve"> </w:t>
+      </w:r>
+      <w:r>
+        <w:t xml:space="preserve">anchor,</w:t>
+      </w:r>
+      <w:r>
+        <w:rPr>
+          <w:vertAlign w:val="superscript"/>
+        </w:rPr>
+        <w:t xml:space="preserve">18</w:t>
+      </w:r>
+      <w:r>
+        <w:t xml:space="preserve"> </w:t>
+      </w:r>
+      <w:r>
         <w:t xml:space="preserve">a Medicare-payer-perspective decision-tree comparing Pipelle</w:t>
       </w:r>
       <w:r>
@@ -1672,7 +1684,7 @@
         <w:rPr>
           <w:vertAlign w:val="superscript"/>
         </w:rPr>
-        <w:t xml:space="preserve">18</w:t>
+        <w:t xml:space="preserve">19</w:t>
       </w:r>
     </w:p>
     <w:p>
@@ -2135,7 +2147,7 @@
         <w:t xml:space="preserve"> </w:t>
       </w:r>
       <w:r>
-        <w:t xml:space="preserve">localities spanning a national low-cost to high-cost range, and illustrative</w:t>
+        <w:t xml:space="preserve">localities spanning a national low-cost to high-cost range, and empirical</w:t>
       </w:r>
       <w:r>
         <w:t xml:space="preserve"> </w:t>
@@ -2904,6 +2916,30 @@
       </w:r>
       <w:r>
         <w:t xml:space="preserve">patient-centered approach. J Oncol Pract 2011;7:43-47.</w:t>
+      </w:r>
+    </w:p>
+    <w:p>
+      <w:pPr>
+        <w:pStyle w:val="Compact"/>
+        <w:numPr>
+          <w:ilvl w:val="0"/>
+          <w:numId w:val="1001"/>
+        </w:numPr>
+      </w:pPr>
+      <w:r>
+        <w:t xml:space="preserve">Trilliant Health. Hospital MRF Data Directory: consolidated hospital price transparency</w:t>
+      </w:r>
+      <w:r>
+        <w:t xml:space="preserve"> </w:t>
+      </w:r>
+      <w:r>
+        <w:t xml:space="preserve">machine-readable file data (snapshot July 21, 2026). Accessed September 12, 2026.</w:t>
+      </w:r>
+      <w:r>
+        <w:t xml:space="preserve"> </w:t>
+      </w:r>
+      <w:r>
+        <w:t xml:space="preserve">https://oria-data.trillianthealth.com/</w:t>
       </w:r>
     </w:p>
     <w:p>

</xml_diff>